<commit_message>
Add PDF version of academic use license
</commit_message>
<xml_diff>
--- a/HUG-VIS_Dataset_Academic_Use_License.docx
+++ b/HUG-VIS_Dataset_Academic_Use_License.docx
@@ -71,6 +71,8 @@
         <w:spacing w:before="0" w:after="0" w:line="240" w:lineRule="auto"/>
         <w:jc w:val="center"/>
       </w:pPr>
+      <w:bookmarkStart w:id="0" w:name="_GoBack"/>
+      <w:bookmarkEnd w:id="0"/>
       <w:r>
         <w:rPr>
           <w:rFonts w:hint="eastAsia" w:ascii="Times New Roman" w:hAnsi="Times New Roman" w:eastAsia="Times New Roman"/>
@@ -79,7 +81,7 @@
           <w:sz w:val="22"/>
           <w:u w:val="none"/>
         </w:rPr>
-        <w:t xml:space="preserve">Shenzhen University; Guangdong Laboratory of Artificial Intelligence and Digital Economy (SZ) </w:t>
+        <w:t xml:space="preserve">Guangdong Laboratory of Artificial Intelligence and Digital Economy (SZ) </w:t>
       </w:r>
     </w:p>
     <w:p>
@@ -128,8 +130,8 @@
         </w:tblCellMar>
       </w:tblPr>
       <w:tblGrid>
-        <w:gridCol w:w="4987"/>
-        <w:gridCol w:w="4987"/>
+        <w:gridCol w:w="1668"/>
+        <w:gridCol w:w="8306"/>
       </w:tblGrid>
       <w:tr>
         <w:trPr>
@@ -138,7 +140,7 @@
         </w:trPr>
         <w:tc>
           <w:tcPr>
-            <w:tcW w:w="2232" w:type="dxa"/>
+            <w:tcW w:w="1668" w:type="dxa"/>
             <w:tcBorders>
               <w:top w:val="nil"/>
               <w:left w:val="nil"/>
@@ -172,7 +174,7 @@
         </w:tc>
         <w:tc>
           <w:tcPr>
-            <w:tcW w:w="7416" w:type="dxa"/>
+            <w:tcW w:w="8306" w:type="dxa"/>
             <w:tcBorders>
               <w:top w:val="nil"/>
               <w:left w:val="nil"/>
@@ -213,7 +215,7 @@
         </w:trPr>
         <w:tc>
           <w:tcPr>
-            <w:tcW w:w="2232" w:type="dxa"/>
+            <w:tcW w:w="1668" w:type="dxa"/>
             <w:tcBorders>
               <w:top w:val="nil"/>
               <w:left w:val="nil"/>
@@ -247,7 +249,7 @@
         </w:tc>
         <w:tc>
           <w:tcPr>
-            <w:tcW w:w="7416" w:type="dxa"/>
+            <w:tcW w:w="8306" w:type="dxa"/>
             <w:tcBorders>
               <w:top w:val="nil"/>
               <w:left w:val="nil"/>
@@ -288,7 +290,7 @@
         </w:trPr>
         <w:tc>
           <w:tcPr>
-            <w:tcW w:w="2232" w:type="dxa"/>
+            <w:tcW w:w="1668" w:type="dxa"/>
             <w:tcBorders>
               <w:top w:val="nil"/>
               <w:left w:val="nil"/>
@@ -322,7 +324,7 @@
         </w:tc>
         <w:tc>
           <w:tcPr>
-            <w:tcW w:w="7416" w:type="dxa"/>
+            <w:tcW w:w="8306" w:type="dxa"/>
             <w:tcBorders>
               <w:top w:val="nil"/>
               <w:left w:val="nil"/>
@@ -363,7 +365,7 @@
         </w:trPr>
         <w:tc>
           <w:tcPr>
-            <w:tcW w:w="2232" w:type="dxa"/>
+            <w:tcW w:w="1668" w:type="dxa"/>
             <w:tcBorders>
               <w:top w:val="nil"/>
               <w:left w:val="nil"/>
@@ -397,7 +399,7 @@
         </w:tc>
         <w:tc>
           <w:tcPr>
-            <w:tcW w:w="7416" w:type="dxa"/>
+            <w:tcW w:w="8306" w:type="dxa"/>
             <w:tcBorders>
               <w:top w:val="nil"/>
               <w:left w:val="nil"/>
@@ -458,8 +460,6 @@
         </w:rPr>
         <w:t xml:space="preserve">Upon approval, the Applicant will receive personal access credentials to the HUG-VIS audiovisual recordings, text, metadata, annotations, alpha mattes, and related files (collectively, the “Dataset”). The Dataset is provided solely for non-commercial academic research and scholarly publication. Any work using the Dataset must cite: </w:t>
       </w:r>
-      <w:bookmarkStart w:id="0" w:name="_GoBack"/>
-      <w:bookmarkEnd w:id="0"/>
     </w:p>
     <w:p>
       <w:pPr>
@@ -1078,8 +1078,8 @@
         </w:tblCellMar>
       </w:tblPr>
       <w:tblGrid>
-        <w:gridCol w:w="4987"/>
-        <w:gridCol w:w="4987"/>
+        <w:gridCol w:w="1340"/>
+        <w:gridCol w:w="8634"/>
       </w:tblGrid>
       <w:tr>
         <w:trPr>
@@ -1088,7 +1088,7 @@
         </w:trPr>
         <w:tc>
           <w:tcPr>
-            <w:tcW w:w="2232" w:type="dxa"/>
+            <w:tcW w:w="1340" w:type="dxa"/>
             <w:tcBorders>
               <w:top w:val="nil"/>
               <w:left w:val="nil"/>
@@ -1122,7 +1122,7 @@
         </w:tc>
         <w:tc>
           <w:tcPr>
-            <w:tcW w:w="7416" w:type="dxa"/>
+            <w:tcW w:w="8634" w:type="dxa"/>
             <w:tcBorders>
               <w:top w:val="nil"/>
               <w:left w:val="nil"/>
@@ -1163,7 +1163,7 @@
         </w:trPr>
         <w:tc>
           <w:tcPr>
-            <w:tcW w:w="2232" w:type="dxa"/>
+            <w:tcW w:w="1340" w:type="dxa"/>
             <w:tcBorders>
               <w:top w:val="nil"/>
               <w:left w:val="nil"/>
@@ -1197,7 +1197,7 @@
         </w:tc>
         <w:tc>
           <w:tcPr>
-            <w:tcW w:w="7416" w:type="dxa"/>
+            <w:tcW w:w="8634" w:type="dxa"/>
             <w:tcBorders>
               <w:top w:val="nil"/>
               <w:left w:val="nil"/>

</xml_diff>